<commit_message>
no se cambian los llamados en word
</commit_message>
<xml_diff>
--- a/Formatos_Cruce/Desactivar factura virtual.docx
+++ b/Formatos_Cruce/Desactivar factura virtual.docx
@@ -155,7 +155,7 @@
           <w:noProof/>
           <w:lang w:val="es-CO" w:eastAsia="en-US"/>
         </w:rPr>
-        <w:t>NOMBRE_RADICADO</w:t>
+        <w:t>nombre_radicado</w:t>
       </w:r>
       <w:r>
         <w:rPr>
@@ -839,7 +839,33 @@
           <w:noProof/>
           <w:lang w:val="es-CO" w:eastAsia="en-US"/>
         </w:rPr>
-        <w:t>Nombre_Radicado</w:t>
+        <w:t>n</w:t>
+      </w:r>
+      <w:r>
+        <w:rPr>
+          <w:rFonts w:ascii="Arial" w:eastAsia="Calibri" w:hAnsi="Arial" w:cs="Arial"/>
+          <w:noProof/>
+          <w:lang w:val="es-CO" w:eastAsia="en-US"/>
+        </w:rPr>
+        <w:t>ombre_</w:t>
+      </w:r>
+      <w:r>
+        <w:rPr>
+          <w:rFonts w:ascii="Arial" w:eastAsia="Calibri" w:hAnsi="Arial" w:cs="Arial"/>
+          <w:noProof/>
+          <w:lang w:val="es-CO" w:eastAsia="en-US"/>
+        </w:rPr>
+        <w:t>r</w:t>
+      </w:r>
+      <w:bookmarkStart w:id="0" w:name="_GoBack"/>
+      <w:bookmarkEnd w:id="0"/>
+      <w:r>
+        <w:rPr>
+          <w:rFonts w:ascii="Arial" w:eastAsia="Calibri" w:hAnsi="Arial" w:cs="Arial"/>
+          <w:noProof/>
+          <w:lang w:val="es-CO" w:eastAsia="en-US"/>
+        </w:rPr>
+        <w:t>adicado</w:t>
       </w:r>
       <w:r>
         <w:rPr>
@@ -1846,10 +1872,10 @@
           <w:lang w:val="es-CO" w:eastAsia="es-CO"/>
         </w:rPr>
       </w:pPr>
-      <w:bookmarkStart w:id="0" w:name="_Hlk124083949"/>
-      <w:bookmarkStart w:id="1" w:name="_Hlk117529920"/>
-      <w:bookmarkStart w:id="2" w:name="_Hlk108018288"/>
-      <w:bookmarkStart w:id="3" w:name="_Hlk101462265"/>
+      <w:bookmarkStart w:id="1" w:name="_Hlk124083949"/>
+      <w:bookmarkStart w:id="2" w:name="_Hlk117529920"/>
+      <w:bookmarkStart w:id="3" w:name="_Hlk108018288"/>
+      <w:bookmarkStart w:id="4" w:name="_Hlk101462265"/>
     </w:p>
     <w:p>
       <w:pPr>
@@ -1866,17 +1892,17 @@
         </w:rPr>
         <w:t xml:space="preserve">RESOLVER </w:t>
       </w:r>
-      <w:bookmarkStart w:id="4" w:name="_Hlk125988342"/>
+      <w:bookmarkStart w:id="5" w:name="_Hlk125988342"/>
       <w:r>
         <w:rPr>
           <w:rFonts w:ascii="Arial" w:hAnsi="Arial" w:cs="Arial"/>
         </w:rPr>
         <w:t>cada una de las inquietudes presentadas, de acuerdo con lo expuesto en la parte motiva del presente acto administrativo.</w:t>
       </w:r>
-      <w:bookmarkEnd w:id="0"/>
-      <w:bookmarkEnd w:id="4"/>
+      <w:bookmarkEnd w:id="1"/>
+      <w:bookmarkEnd w:id="5"/>
     </w:p>
-    <w:bookmarkEnd w:id="1"/>
+    <w:bookmarkEnd w:id="2"/>
     <w:p>
       <w:pPr>
         <w:jc w:val="both"/>
@@ -1898,10 +1924,10 @@
           <w:lang w:val="es-CO" w:eastAsia="en-US"/>
         </w:rPr>
       </w:pPr>
-      <w:bookmarkStart w:id="5" w:name="_Hlk170132818"/>
-      <w:bookmarkStart w:id="6" w:name="_Hlk106184349"/>
-      <w:bookmarkEnd w:id="2"/>
+      <w:bookmarkStart w:id="6" w:name="_Hlk170132818"/>
+      <w:bookmarkStart w:id="7" w:name="_Hlk106184349"/>
       <w:bookmarkEnd w:id="3"/>
+      <w:bookmarkEnd w:id="4"/>
       <w:r>
         <w:rPr>
           <w:rFonts w:ascii="Arial" w:eastAsia="Calibri" w:hAnsi="Arial" w:cs="Arial"/>
@@ -1979,10 +2005,51 @@
           <w:noProof/>
           <w:lang w:val="es-CO" w:eastAsia="en-US"/>
         </w:rPr>
-        <w:t>radicado</w:t>
-      </w:r>
-      <w:bookmarkStart w:id="7" w:name="_GoBack"/>
-      <w:bookmarkEnd w:id="7"/>
+        <w:t>radicado}}</w:t>
+      </w:r>
+      <w:r>
+        <w:rPr>
+          <w:rFonts w:ascii="Arial" w:eastAsia="Calibri" w:hAnsi="Arial" w:cs="Arial"/>
+          <w:b/>
+          <w:bCs/>
+          <w:lang w:val="es-CO" w:eastAsia="en-US"/>
+        </w:rPr>
+        <w:fldChar w:fldCharType="end"/>
+      </w:r>
+      <w:r>
+        <w:rPr>
+          <w:rFonts w:ascii="Arial" w:eastAsia="Calibri" w:hAnsi="Arial" w:cs="Arial"/>
+          <w:lang w:val="es-CO" w:eastAsia="en-US"/>
+        </w:rPr>
+        <w:t xml:space="preserve"> al correo electrónico </w:t>
+      </w:r>
+      <w:r>
+        <w:rPr>
+          <w:rFonts w:ascii="Arial" w:eastAsia="Calibri" w:hAnsi="Arial" w:cs="Arial"/>
+          <w:b/>
+          <w:bCs/>
+          <w:lang w:val="es-CO" w:eastAsia="en-US"/>
+        </w:rPr>
+        <w:fldChar w:fldCharType="begin"/>
+      </w:r>
+      <w:r>
+        <w:rPr>
+          <w:rFonts w:ascii="Arial" w:eastAsia="Calibri" w:hAnsi="Arial" w:cs="Arial"/>
+          <w:b/>
+          <w:bCs/>
+          <w:lang w:val="es-CO" w:eastAsia="en-US"/>
+        </w:rPr>
+        <w:instrText xml:space="preserve"> MERGEFIELD correo </w:instrText>
+      </w:r>
+      <w:r>
+        <w:rPr>
+          <w:rFonts w:ascii="Arial" w:eastAsia="Calibri" w:hAnsi="Arial" w:cs="Arial"/>
+          <w:b/>
+          <w:bCs/>
+          <w:lang w:val="es-CO" w:eastAsia="en-US"/>
+        </w:rPr>
+        <w:fldChar w:fldCharType="separate"/>
+      </w:r>
       <w:r>
         <w:rPr>
           <w:rFonts w:ascii="Arial" w:eastAsia="Calibri" w:hAnsi="Arial" w:cs="Arial"/>
@@ -1991,6 +2058,26 @@
           <w:noProof/>
           <w:lang w:val="es-CO" w:eastAsia="en-US"/>
         </w:rPr>
+        <w:t>{{</w:t>
+      </w:r>
+      <w:r>
+        <w:rPr>
+          <w:rFonts w:ascii="Arial" w:eastAsia="Calibri" w:hAnsi="Arial" w:cs="Arial"/>
+          <w:b/>
+          <w:bCs/>
+          <w:noProof/>
+          <w:lang w:val="es-CO" w:eastAsia="en-US"/>
+        </w:rPr>
+        <w:t>correo</w:t>
+      </w:r>
+      <w:r>
+        <w:rPr>
+          <w:rFonts w:ascii="Arial" w:eastAsia="Calibri" w:hAnsi="Arial" w:cs="Arial"/>
+          <w:b/>
+          <w:bCs/>
+          <w:noProof/>
+          <w:lang w:val="es-CO" w:eastAsia="en-US"/>
+        </w:rPr>
         <w:t>}}</w:t>
       </w:r>
       <w:r>
@@ -2007,7 +2094,7 @@
           <w:rFonts w:ascii="Arial" w:eastAsia="Calibri" w:hAnsi="Arial" w:cs="Arial"/>
           <w:lang w:val="es-CO" w:eastAsia="en-US"/>
         </w:rPr>
-        <w:t xml:space="preserve"> al correo electrónico </w:t>
+        <w:t xml:space="preserve">; en caso de presentar fallo en la entrega del correo electrónico y acorde con los lineamientos legales establecidos en los artículos 67, 68 y 69 del Código de Procedimiento Administrativo y de lo Contencioso Administrativo enviar CITACION para notificación personal al peticionario </w:t>
       </w:r>
       <w:r>
         <w:rPr>
@@ -2025,7 +2112,14 @@
           <w:bCs/>
           <w:lang w:val="es-CO" w:eastAsia="en-US"/>
         </w:rPr>
-        <w:instrText xml:space="preserve"> MERGEFIELD correo </w:instrText>
+        <w:instrText xml:space="preserve"> MERGEFIELD nombre_radicado </w:instrText>
+      </w:r>
+      <w:r>
+        <w:rPr>
+          <w:rFonts w:ascii="Arial" w:eastAsia="Calibri" w:hAnsi="Arial" w:cs="Arial"/>
+          <w:lang w:val="es-CO" w:eastAsia="en-US"/>
+        </w:rPr>
+        <w:instrText>\* Upper</w:instrText>
       </w:r>
       <w:r>
         <w:rPr>
@@ -2044,6 +2138,88 @@
           <w:noProof/>
           <w:lang w:val="es-CO" w:eastAsia="en-US"/>
         </w:rPr>
+        <w:t>{{nombre</w:t>
+      </w:r>
+      <w:r>
+        <w:rPr>
+          <w:rFonts w:ascii="Arial" w:eastAsia="Calibri" w:hAnsi="Arial" w:cs="Arial"/>
+          <w:b/>
+          <w:bCs/>
+          <w:noProof/>
+          <w:lang w:val="es-CO" w:eastAsia="en-US"/>
+        </w:rPr>
+        <w:t>_</w:t>
+      </w:r>
+      <w:r>
+        <w:rPr>
+          <w:rFonts w:ascii="Arial" w:eastAsia="Calibri" w:hAnsi="Arial" w:cs="Arial"/>
+          <w:b/>
+          <w:bCs/>
+          <w:noProof/>
+          <w:lang w:val="es-CO" w:eastAsia="en-US"/>
+        </w:rPr>
+        <w:t>radicado}}</w:t>
+      </w:r>
+      <w:r>
+        <w:rPr>
+          <w:rFonts w:ascii="Arial" w:eastAsia="Calibri" w:hAnsi="Arial" w:cs="Arial"/>
+          <w:b/>
+          <w:bCs/>
+          <w:lang w:val="es-CO" w:eastAsia="en-US"/>
+        </w:rPr>
+        <w:fldChar w:fldCharType="end"/>
+      </w:r>
+      <w:r>
+        <w:rPr>
+          <w:rFonts w:ascii="Arial" w:eastAsia="Calibri" w:hAnsi="Arial" w:cs="Arial"/>
+          <w:b/>
+          <w:bCs/>
+          <w:lang w:val="es-CO" w:eastAsia="en-US"/>
+        </w:rPr>
+        <w:t xml:space="preserve"> </w:t>
+      </w:r>
+      <w:r>
+        <w:rPr>
+          <w:rFonts w:ascii="Arial" w:eastAsia="Calibri" w:hAnsi="Arial" w:cs="Arial"/>
+          <w:lang w:val="es-CO" w:eastAsia="en-US"/>
+        </w:rPr>
+        <w:t xml:space="preserve">a la dirección </w:t>
+      </w:r>
+      <w:r>
+        <w:rPr>
+          <w:rFonts w:ascii="Arial" w:eastAsia="Calibri" w:hAnsi="Arial" w:cs="Arial"/>
+          <w:b/>
+          <w:bCs/>
+          <w:lang w:val="es-CO" w:eastAsia="en-US"/>
+        </w:rPr>
+        <w:fldChar w:fldCharType="begin"/>
+      </w:r>
+      <w:r>
+        <w:rPr>
+          <w:rFonts w:ascii="Arial" w:eastAsia="Calibri" w:hAnsi="Arial" w:cs="Arial"/>
+          <w:b/>
+          <w:bCs/>
+          <w:lang w:val="es-CO" w:eastAsia="en-US"/>
+        </w:rPr>
+        <w:instrText xml:space="preserve"> MERGEFIELD direccion </w:instrText>
+      </w:r>
+      <w:r>
+        <w:rPr>
+          <w:rFonts w:ascii="Arial" w:eastAsia="Calibri" w:hAnsi="Arial" w:cs="Arial"/>
+          <w:b/>
+          <w:bCs/>
+          <w:lang w:val="es-CO" w:eastAsia="en-US"/>
+        </w:rPr>
+        <w:fldChar w:fldCharType="separate"/>
+      </w:r>
+      <w:r>
+        <w:rPr>
+          <w:rFonts w:ascii="Arial" w:eastAsia="Calibri" w:hAnsi="Arial" w:cs="Arial"/>
+          <w:b/>
+          <w:bCs/>
+          <w:noProof/>
+          <w:lang w:val="es-CO" w:eastAsia="en-US"/>
+        </w:rPr>
         <w:t>{{</w:t>
       </w:r>
       <w:r>
@@ -2054,7 +2230,7 @@
           <w:noProof/>
           <w:lang w:val="es-CO" w:eastAsia="en-US"/>
         </w:rPr>
-        <w:t>correo</w:t>
+        <w:t>direccion</w:t>
       </w:r>
       <w:r>
         <w:rPr>
@@ -2078,9 +2254,19 @@
       <w:r>
         <w:rPr>
           <w:rFonts w:ascii="Arial" w:eastAsia="Calibri" w:hAnsi="Arial" w:cs="Arial"/>
-          <w:lang w:val="es-CO" w:eastAsia="en-US"/>
-        </w:rPr>
-        <w:t xml:space="preserve">; en caso de presentar fallo en la entrega del correo electrónico y acorde con los lineamientos legales establecidos en los artículos 67, 68 y 69 del Código de Procedimiento Administrativo y de lo Contencioso Administrativo enviar CITACION para notificación personal al peticionario </w:t>
+          <w:b/>
+          <w:bCs/>
+          <w:color w:val="FF0000"/>
+          <w:lang w:val="es-CO" w:eastAsia="en-US"/>
+        </w:rPr>
+        <w:t xml:space="preserve"> </w:t>
+      </w:r>
+      <w:r>
+        <w:rPr>
+          <w:rFonts w:ascii="Arial" w:eastAsia="Calibri" w:hAnsi="Arial" w:cs="Arial"/>
+          <w:lang w:val="es-CO" w:eastAsia="en-US"/>
+        </w:rPr>
+        <w:t>en la ciudad de Bogotá D.C. Tel.:</w:t>
       </w:r>
       <w:r>
         <w:rPr>
@@ -2098,14 +2284,7 @@
           <w:bCs/>
           <w:lang w:val="es-CO" w:eastAsia="en-US"/>
         </w:rPr>
-        <w:instrText xml:space="preserve"> MERGEFIELD nombre_radicado </w:instrText>
-      </w:r>
-      <w:r>
-        <w:rPr>
-          <w:rFonts w:ascii="Arial" w:eastAsia="Calibri" w:hAnsi="Arial" w:cs="Arial"/>
-          <w:lang w:val="es-CO" w:eastAsia="en-US"/>
-        </w:rPr>
-        <w:instrText>\* Upper</w:instrText>
+        <w:instrText xml:space="preserve"> MERGEFIELD telefono </w:instrText>
       </w:r>
       <w:r>
         <w:rPr>
@@ -2124,7 +2303,7 @@
           <w:noProof/>
           <w:lang w:val="es-CO" w:eastAsia="en-US"/>
         </w:rPr>
-        <w:t>{{nombre</w:t>
+        <w:t>{{</w:t>
       </w:r>
       <w:r>
         <w:rPr>
@@ -2134,175 +2313,8 @@
           <w:noProof/>
           <w:lang w:val="es-CO" w:eastAsia="en-US"/>
         </w:rPr>
-        <w:t>_</w:t>
-      </w:r>
-      <w:r>
-        <w:rPr>
-          <w:rFonts w:ascii="Arial" w:eastAsia="Calibri" w:hAnsi="Arial" w:cs="Arial"/>
-          <w:b/>
-          <w:bCs/>
-          <w:noProof/>
-          <w:lang w:val="es-CO" w:eastAsia="en-US"/>
-        </w:rPr>
-        <w:t>radicado}}</w:t>
-      </w:r>
-      <w:r>
-        <w:rPr>
-          <w:rFonts w:ascii="Arial" w:eastAsia="Calibri" w:hAnsi="Arial" w:cs="Arial"/>
-          <w:b/>
-          <w:bCs/>
-          <w:lang w:val="es-CO" w:eastAsia="en-US"/>
-        </w:rPr>
-        <w:fldChar w:fldCharType="end"/>
-      </w:r>
-      <w:r>
-        <w:rPr>
-          <w:rFonts w:ascii="Arial" w:eastAsia="Calibri" w:hAnsi="Arial" w:cs="Arial"/>
-          <w:b/>
-          <w:bCs/>
-          <w:lang w:val="es-CO" w:eastAsia="en-US"/>
-        </w:rPr>
-        <w:t xml:space="preserve"> </w:t>
-      </w:r>
-      <w:r>
-        <w:rPr>
-          <w:rFonts w:ascii="Arial" w:eastAsia="Calibri" w:hAnsi="Arial" w:cs="Arial"/>
-          <w:lang w:val="es-CO" w:eastAsia="en-US"/>
-        </w:rPr>
-        <w:t xml:space="preserve">a la dirección </w:t>
-      </w:r>
-      <w:r>
-        <w:rPr>
-          <w:rFonts w:ascii="Arial" w:eastAsia="Calibri" w:hAnsi="Arial" w:cs="Arial"/>
-          <w:b/>
-          <w:bCs/>
-          <w:lang w:val="es-CO" w:eastAsia="en-US"/>
-        </w:rPr>
-        <w:fldChar w:fldCharType="begin"/>
-      </w:r>
-      <w:r>
-        <w:rPr>
-          <w:rFonts w:ascii="Arial" w:eastAsia="Calibri" w:hAnsi="Arial" w:cs="Arial"/>
-          <w:b/>
-          <w:bCs/>
-          <w:lang w:val="es-CO" w:eastAsia="en-US"/>
-        </w:rPr>
-        <w:instrText xml:space="preserve"> MERGEFIELD direccion </w:instrText>
-      </w:r>
-      <w:r>
-        <w:rPr>
-          <w:rFonts w:ascii="Arial" w:eastAsia="Calibri" w:hAnsi="Arial" w:cs="Arial"/>
-          <w:b/>
-          <w:bCs/>
-          <w:lang w:val="es-CO" w:eastAsia="en-US"/>
-        </w:rPr>
-        <w:fldChar w:fldCharType="separate"/>
-      </w:r>
-      <w:r>
-        <w:rPr>
-          <w:rFonts w:ascii="Arial" w:eastAsia="Calibri" w:hAnsi="Arial" w:cs="Arial"/>
-          <w:b/>
-          <w:bCs/>
-          <w:noProof/>
-          <w:lang w:val="es-CO" w:eastAsia="en-US"/>
-        </w:rPr>
-        <w:t>{{</w:t>
-      </w:r>
-      <w:r>
-        <w:rPr>
-          <w:rFonts w:ascii="Arial" w:eastAsia="Calibri" w:hAnsi="Arial" w:cs="Arial"/>
-          <w:b/>
-          <w:bCs/>
-          <w:noProof/>
-          <w:lang w:val="es-CO" w:eastAsia="en-US"/>
-        </w:rPr>
-        <w:t>direccion</w:t>
-      </w:r>
-      <w:r>
-        <w:rPr>
-          <w:rFonts w:ascii="Arial" w:eastAsia="Calibri" w:hAnsi="Arial" w:cs="Arial"/>
-          <w:b/>
-          <w:bCs/>
-          <w:noProof/>
-          <w:lang w:val="es-CO" w:eastAsia="en-US"/>
-        </w:rPr>
-        <w:t>}}</w:t>
-      </w:r>
-      <w:r>
-        <w:rPr>
-          <w:rFonts w:ascii="Arial" w:eastAsia="Calibri" w:hAnsi="Arial" w:cs="Arial"/>
-          <w:b/>
-          <w:bCs/>
-          <w:lang w:val="es-CO" w:eastAsia="en-US"/>
-        </w:rPr>
-        <w:fldChar w:fldCharType="end"/>
-      </w:r>
-      <w:r>
-        <w:rPr>
-          <w:rFonts w:ascii="Arial" w:eastAsia="Calibri" w:hAnsi="Arial" w:cs="Arial"/>
-          <w:b/>
-          <w:bCs/>
-          <w:color w:val="FF0000"/>
-          <w:lang w:val="es-CO" w:eastAsia="en-US"/>
-        </w:rPr>
-        <w:t xml:space="preserve"> </w:t>
-      </w:r>
-      <w:r>
-        <w:rPr>
-          <w:rFonts w:ascii="Arial" w:eastAsia="Calibri" w:hAnsi="Arial" w:cs="Arial"/>
-          <w:lang w:val="es-CO" w:eastAsia="en-US"/>
-        </w:rPr>
-        <w:t>en la ciudad de Bogotá D.C. Tel.:</w:t>
-      </w:r>
-      <w:r>
-        <w:rPr>
-          <w:rFonts w:ascii="Arial" w:eastAsia="Calibri" w:hAnsi="Arial" w:cs="Arial"/>
-          <w:b/>
-          <w:bCs/>
-          <w:lang w:val="es-CO" w:eastAsia="en-US"/>
-        </w:rPr>
-        <w:fldChar w:fldCharType="begin"/>
-      </w:r>
-      <w:r>
-        <w:rPr>
-          <w:rFonts w:ascii="Arial" w:eastAsia="Calibri" w:hAnsi="Arial" w:cs="Arial"/>
-          <w:b/>
-          <w:bCs/>
-          <w:lang w:val="es-CO" w:eastAsia="en-US"/>
-        </w:rPr>
-        <w:instrText xml:space="preserve"> MERGEFIELD telefono </w:instrText>
-      </w:r>
-      <w:r>
-        <w:rPr>
-          <w:rFonts w:ascii="Arial" w:eastAsia="Calibri" w:hAnsi="Arial" w:cs="Arial"/>
-          <w:b/>
-          <w:bCs/>
-          <w:lang w:val="es-CO" w:eastAsia="en-US"/>
-        </w:rPr>
-        <w:fldChar w:fldCharType="separate"/>
-      </w:r>
-      <w:r>
-        <w:rPr>
-          <w:rFonts w:ascii="Arial" w:eastAsia="Calibri" w:hAnsi="Arial" w:cs="Arial"/>
-          <w:b/>
-          <w:bCs/>
-          <w:noProof/>
-          <w:lang w:val="es-CO" w:eastAsia="en-US"/>
-        </w:rPr>
-        <w:t>{{</w:t>
-      </w:r>
-      <w:proofErr w:type="spellStart"/>
-      <w:r>
-        <w:rPr>
-          <w:rFonts w:ascii="Arial" w:eastAsia="Calibri" w:hAnsi="Arial" w:cs="Arial"/>
-          <w:b/>
-          <w:bCs/>
-          <w:noProof/>
-          <w:lang w:val="es-CO" w:eastAsia="en-US"/>
-        </w:rPr>
         <w:t>telefono</w:t>
       </w:r>
-      <w:proofErr w:type="spellEnd"/>
       <w:r>
         <w:rPr>
           <w:rFonts w:ascii="Arial" w:eastAsia="Calibri" w:hAnsi="Arial" w:cs="Arial"/>
@@ -2558,7 +2570,6 @@
         </w:rPr>
         <w:t>{{</w:t>
       </w:r>
-      <w:proofErr w:type="spellStart"/>
       <w:r>
         <w:rPr>
           <w:rFonts w:ascii="Arial" w:hAnsi="Arial" w:cs="Arial"/>
@@ -2568,7 +2579,6 @@
         </w:rPr>
         <w:t>telefono</w:t>
       </w:r>
-      <w:proofErr w:type="spellEnd"/>
       <w:r>
         <w:rPr>
           <w:rFonts w:ascii="Arial" w:hAnsi="Arial" w:cs="Arial"/>
@@ -2605,8 +2615,8 @@
         </w:rPr>
       </w:pPr>
     </w:p>
-    <w:bookmarkEnd w:id="5"/>
     <w:bookmarkEnd w:id="6"/>
+    <w:bookmarkEnd w:id="7"/>
     <w:p>
       <w:pPr>
         <w:contextualSpacing/>
@@ -3443,21 +3453,21 @@
         <v:path o:extrusionok="f" gradientshapeok="t" o:connecttype="rect"/>
         <o:lock v:ext="edit" aspectratio="t"/>
       </v:shapetype>
-      <v:shape id="_x0000_i1191" type="#_x0000_t75" style="width:14.4pt;height:14.4pt" o:bullet="t">
+      <v:shape id="_x0000_i1487" type="#_x0000_t75" style="width:14.25pt;height:14.25pt" o:bullet="t">
         <v:imagedata r:id="rId1" o:title="mso2D3D"/>
       </v:shape>
     </w:pict>
   </w:numPicBullet>
   <w:numPicBullet w:numPicBulletId="1">
     <w:pict>
-      <v:shape id="_x0000_i1192" type="#_x0000_t75" style="width:14.4pt;height:14.4pt" o:bullet="t">
+      <v:shape id="_x0000_i1488" type="#_x0000_t75" style="width:14.25pt;height:14.25pt" o:bullet="t">
         <v:imagedata r:id="rId2" o:title="msoCA65"/>
       </v:shape>
     </w:pict>
   </w:numPicBullet>
   <w:numPicBullet w:numPicBulletId="2">
     <w:pict>
-      <v:shape id="_x0000_i1193" type="#_x0000_t75" style="width:1in;height:50.4pt" o:bullet="t">
+      <v:shape id="_x0000_i1489" type="#_x0000_t75" style="width:1in;height:50.25pt" o:bullet="t">
         <v:imagedata r:id="rId3" o:title="clip_image002"/>
       </v:shape>
     </w:pict>
@@ -10053,7 +10063,7 @@
 </file>
 
 <file path=customXml/itemProps1.xml><?xml version="1.0" encoding="utf-8"?>
-<ds:datastoreItem xmlns:ds="http://schemas.openxmlformats.org/officeDocument/2006/customXml" ds:itemID="{9259126F-E84C-43CF-A2C0-8282BBB0768C}">
+<ds:datastoreItem xmlns:ds="http://schemas.openxmlformats.org/officeDocument/2006/customXml" ds:itemID="{ADDC8A4A-527B-4FB9-8F93-7FC9B783CFE9}">
   <ds:schemaRefs>
     <ds:schemaRef ds:uri="http://schemas.openxmlformats.org/officeDocument/2006/bibliography"/>
   </ds:schemaRefs>

</xml_diff>